<commit_message>
Remove point point labels from headings in Project 4 report
</commit_message>
<xml_diff>
--- a/code/ECE473/ECE473_Project4_Report_ShashwatChoudhry.docx
+++ b/code/ECE473/ECE473_Project4_Report_ShashwatChoudhry.docx
@@ -167,7 +167,7 @@
           <w:color w:val="001F3F"/>
           <w:sz w:val="22"/>
         </w:rPr>
-        <w:t>Question II.1 (1 point): Misconfiguring CASSANDRA_CLUSTER_NAME in docker-compose.yml</w:t>
+        <w:t>Question II.1: Misconfiguring CASSANDRA_CLUSTER_NAME in docker-compose.yml</w:t>
       </w:r>
     </w:p>
     <w:p>
@@ -263,7 +263,7 @@
           <w:color w:val="001F3F"/>
           <w:sz w:val="22"/>
         </w:rPr>
-        <w:t>Question II.2 (1 point): Purpose of CASSANDRA_SEEDS and Listing Server Requirements</w:t>
+        <w:t>Question II.2: Purpose of CASSANDRA_SEEDS and Listing Server Requirements</w:t>
       </w:r>
     </w:p>
     <w:p>
@@ -398,7 +398,7 @@
           <w:color w:val="001F3F"/>
           <w:sz w:val="22"/>
         </w:rPr>
-        <w:t>Question II.3 (1 point): Cluster Status Screenshot and Meaning of UN in nodetool status</w:t>
+        <w:t>Question II.3: Cluster Status Screenshot and Meaning of UN in nodetool status</w:t>
       </w:r>
     </w:p>
     <w:p>
@@ -579,7 +579,7 @@
           <w:color w:val="001F3F"/>
           <w:sz w:val="22"/>
         </w:rPr>
-        <w:t>Question III.1 (1 point): Service Startup Synchronization and Required Cassandra Nodes</w:t>
+        <w:t>Question III.1: Service Startup Synchronization and Required Cassandra Nodes</w:t>
       </w:r>
     </w:p>
     <w:p>
@@ -760,7 +760,7 @@
           <w:color w:val="001F3F"/>
           <w:sz w:val="22"/>
         </w:rPr>
-        <w:t>Question III.2 (3 points): Database Trace of Baseline Requests</w:t>
+        <w:t>Question III.2: Database Trace of Baseline Requests</w:t>
       </w:r>
     </w:p>
     <w:p>
@@ -1463,7 +1463,7 @@
           <w:color w:val="001F3F"/>
           <w:sz w:val="22"/>
         </w:rPr>
-        <w:t>Question III.3 (2 points): Partitioning available_listings by Year in listed_at</w:t>
+        <w:t>Question III.3: Partitioning available_listings by Year in listed_at</w:t>
       </w:r>
     </w:p>
     <w:p>
@@ -1730,7 +1730,7 @@
           <w:color w:val="001F3F"/>
           <w:sz w:val="22"/>
         </w:rPr>
-        <w:t>Question IV.1 (10 points): In-Depth Analysis of the Five Consistency Configurations</w:t>
+        <w:t>Question IV.1: In-Depth Analysis of the Five Consistency Configurations</w:t>
       </w:r>
     </w:p>
     <w:p>
@@ -3902,7 +3902,7 @@
           <w:color w:val="001F3F"/>
           <w:sz w:val="22"/>
         </w:rPr>
-        <w:t>Question IV.2 (1 point): Feasibility of Combining Cassandra Writes in PostgreSQL Transactions</w:t>
+        <w:t>Question IV.2: Feasibility of Combining Cassandra Writes in PostgreSQL Transactions</w:t>
       </w:r>
     </w:p>
     <w:p>

</xml_diff>